<commit_message>
BV-E2 V: Beispielvorlage neu erzeugt, Wache der Beispielvorlage
Berichtsvorlage_Beispiel.docx neu mit Werkzeuge/Berichtsvorlage (beispiel,
Katalogfassung 2): Kapitelkoepfe {{text.kapitel_<name>}}, Logo der
Kopfzeile als Bildplatzhalter {{bild.ersteller.logo}} mit neutralem
Platzhalterbild (150 x 82 Pixel, /word/media/logoplatzhalter.png),
custom.xml mit EPOS.Katalogfassung = 2 und EPOS.Vorlage = beispiel, drei
Kommentare. Validator Office 2007-2021 0 Fehler; zwei Laeufe byte-gleich.

BerichtsvorlageDateiWacheTests, nur die Zeilen zur Beispielvorlage:
Platzhaltermenge mit text.kapitel_*, Kapitelkopf = Titelplatzhalter des
Kapitels darunter samt Kommentar am ersten Kopf, neu der Bildplatzhalter
der Kopfzeile (genau ein Bild, Alternativtext, Ausdehnung wie das Logo der
Stilvorlage, PNG, kein Bildteil mit den Bytes des Logos) und custom.xml.
Die Zeilen zur Standardvorlage bleiben unberuehrt.

Co-Authored-By: Claude Opus 5.5 <noreply@anthropic.com>
</commit_message>
<xml_diff>
--- a/WindowsFormsApplication1/Allgemein/Bericht/Vorlagen/Berichtsvorlage_Beispiel.docx
+++ b/WindowsFormsApplication1/Allgemein/Bericht/Vorlagen/Berichtsvorlage_Beispiel.docx
@@ -322,8 +322,16 @@
       <w:pPr>
         <w:pStyle w:val="EPOSKapitelkopf"/>
       </w:pPr>
-      <w:r>
-        <w:t xml:space="preserve">Projektbeschreibung</w:t>
+      <w:commentRangeStart w:id="2"/>
+      <w:r>
+        <w:rPr>
+          <w:noProof/>
+        </w:rPr>
+        <w:t xml:space="preserve">{{text.kapitel_projekt}}</w:t>
+      </w:r>
+      <w:commentRangeEnd w:id="2"/>
+      <w:r>
+        <w:commentReference w:id="2"/>
       </w:r>
     </w:p>
     <w:p>
@@ -342,7 +350,10 @@
         <w:pStyle w:val="EPOSKapitelkopf"/>
       </w:pPr>
       <w:r>
-        <w:t xml:space="preserve">Komponenten &amp; Varianten</w:t>
+        <w:rPr>
+          <w:noProof/>
+        </w:rPr>
+        <w:t xml:space="preserve">{{text.kapitel_komponenten}}</w:t>
       </w:r>
     </w:p>
     <w:p>
@@ -361,7 +372,10 @@
         <w:pStyle w:val="EPOSKapitelkopf"/>
       </w:pPr>
       <w:r>
-        <w:t xml:space="preserve">Berechnungsergebnisse je Variante</w:t>
+        <w:rPr>
+          <w:noProof/>
+        </w:rPr>
+        <w:t xml:space="preserve">{{text.kapitel_ergebnisse}}</w:t>
       </w:r>
     </w:p>
     <w:p>
@@ -380,7 +394,10 @@
         <w:pStyle w:val="EPOSKapitelkopf"/>
       </w:pPr>
       <w:r>
-        <w:t xml:space="preserve">Variantenvergleich</w:t>
+        <w:rPr>
+          <w:noProof/>
+        </w:rPr>
+        <w:t xml:space="preserve">{{text.kapitel_vergleich}}</w:t>
       </w:r>
     </w:p>
     <w:p>
@@ -399,7 +416,10 @@
         <w:pStyle w:val="EPOSKapitelkopf"/>
       </w:pPr>
       <w:r>
-        <w:t xml:space="preserve">Wirtschaftlichkeit</w:t>
+        <w:rPr>
+          <w:noProof/>
+        </w:rPr>
+        <w:t xml:space="preserve">{{text.kapitel_wirtschaftlichkeit}}</w:t>
       </w:r>
     </w:p>
     <w:p>
@@ -418,7 +438,10 @@
         <w:pStyle w:val="EPOSKapitelkopf"/>
       </w:pPr>
       <w:r>
-        <w:t xml:space="preserve">Anhang</w:t>
+        <w:rPr>
+          <w:noProof/>
+        </w:rPr>
+        <w:t xml:space="preserve">{{text.kapitel_anhang}}</w:t>
       </w:r>
     </w:p>
     <w:p>
@@ -437,7 +460,10 @@
         <w:pStyle w:val="EPOSKapitelkopf"/>
       </w:pPr>
       <w:r>
-        <w:t xml:space="preserve">Checkliste für den Bewertungsbericht (DIN EN 17463, Anhang E)</w:t>
+        <w:rPr>
+          <w:noProof/>
+        </w:rPr>
+        <w:t xml:space="preserve">{{text.kapitel_anhang_e}}</w:t>
       </w:r>
     </w:p>
     <w:p>
@@ -481,7 +507,12 @@
     </w:p>
     <w:p>
       <w:r>
-        <w:t xml:space="preserve">Diese Datei ist aus dem bisherigen Bericht abgeleitet und die spätere Standardvorlage des Word-Berichts. Kommentare erscheinen nicht im fertigen Bericht.</w:t>
+        <w:t xml:space="preserve">Zur Kopfzeile, weil Word dort keine Kommentare erlaubt: Das Bild rechts ist ein Bildplatzhalter. Sein Alternativtext {{bild.ersteller.logo}} lässt EPOS-Plan an seiner Stelle das Firmenlogo aus den Einstellungen einsetzen; ist keines hinterlegt, entfällt das Bild. Ein festes eigenes Logo ist ebenso möglich: in der eigenen Kopie das Bild durch das Logo ersetzen und den Alternativtext entfernen – sonst setzt EPOS-Plan dort weiter das Logo aus den Einstellungen ein.</w:t>
+      </w:r>
+    </w:p>
+    <w:p>
+      <w:r>
+        <w:t xml:space="preserve">Diese Datei ist aus dem bisherigen Bericht abgeleitet; die Standardvorlage des Word-Berichts hat denselben Aufbau, nur ohne Kommentare. Kommentare erscheinen nicht im fertigen Bericht.</w:t>
       </w:r>
     </w:p>
   </w:comment>
@@ -496,7 +527,22 @@
     </w:p>
     <w:p>
       <w:r>
-        <w:t xml:space="preserve">Bei den übrigen Kapiteln steht die Überschrift in der Vorlage, im Absatzformat „EPOS Kapitelkopf“; die Angabe |ohne titel unterdrückt die eigene Überschrift des Kapitels. Entfällt ein Kapitel – abgewählt oder ohne Daten –, entfällt die Überschrift darüber mit. Die Kapitel stehen in der Reihenfolge des bisherigen Berichts.</w:t>
+        <w:t xml:space="preserve">Die übrigen Kapitel stehen in der Reihenfolge des bisherigen Berichts, jedes unter seinem Kapitelkopf. Die Angabe |ohne titel unterdrückt die eigene Überschrift des Kapitels – die trägt der Kapitelkopf.</w:t>
+      </w:r>
+    </w:p>
+  </w:comment>
+  <w:comment w:initials="EP" w:author="EPOS-Plan" w:id="2">
+    <w:p>
+      <w:r>
+        <w:annotationRef/>
+      </w:r>
+      <w:r>
+        <w:t xml:space="preserve">Der Kapitelkopf ist die Überschrift über einem Kapitel, im Absatzformat „EPOS Kapitelkopf“. {{text.kapitel_projekt}} ist ein Platzhalter für den Kapiteltitel: EPOS-Plan setzt ihn in der Sprache des Berichts ein, wie die Beschriftungen des Deckblatts. Der Platzhalter darf durch eigenen Text ersetzt werden; der steht dann in jeder Sprache so im Bericht.</w:t>
+      </w:r>
+    </w:p>
+    <w:p>
+      <w:r>
+        <w:t xml:space="preserve">Entfällt ein Kapitel – abgewählt oder ohne Daten –, entfällt der Kapitelkopf darüber mit, auch mit eigenem Text. Kapitelkopf und Kapitelplatzhalter gehören zusammen: Wer die Reihenfolge ändert, verschiebt beide.</w:t>
       </w:r>
     </w:p>
   </w:comment>
@@ -686,7 +732,7 @@
         <wp:inline distT="0" distB="0" distL="0" distR="0">
           <wp:extent cx="857250" cy="466725"/>
           <wp:effectExtent l="0" t="0" r="0" b="0"/>
-          <wp:docPr id="1" name="" descr="" title=""/>
+          <wp:docPr id="1" name="" descr="{{bild.ersteller.logo}}" title=""/>
           <wp:cNvGraphicFramePr>
             <a:graphicFrameLocks xmlns:a="http://schemas.openxmlformats.org/drawingml/2006/main" noChangeAspect="1"/>
           </wp:cNvGraphicFramePr>

</xml_diff>